<commit_message>
WIP: CMS I Exam 6 review closed (240/240 blind + audit PASS, 0 wrong-key suspects); 18 guide-addition lines so every question links to a verified passage; guide states the non-rebreather bag rule as the slide does; Pip cards rehashed; Word copies
Co-Authored-By: Claude Opus 5.5 <noreply@anthropic.com>
</commit_message>
<xml_diff>
--- a/Clinical Medicine and Surgery I Exam 6/cms-exam-6-study-guide.docx
+++ b/Clinical Medicine and Surgery I Exam 6/cms-exam-6-study-guide.docx
@@ -1080,221 +1080,192 @@
         <w:spacing w:after="80"/>
       </w:pPr>
     </w:p>
-    <w:tbl>
-      <w:tblPr>
-        <w:tblStyle w:val="TableGrid"/>
-        <w:tblW w:type="auto" w:w="0"/>
-        <w:jc w:val="center"/>
-        <w:tblLook w:firstColumn="1" w:firstRow="1" w:lastColumn="0" w:lastRow="0" w:noHBand="0" w:noVBand="1" w:val="04A0"/>
-        <w:tblBorders>
-          <w:top w:val="single" w:sz="4" w:space="0" w:color="D8D2D4"/>
-          <w:left w:val="single" w:sz="4" w:space="0" w:color="D8D2D4"/>
-          <w:bottom w:val="single" w:sz="4" w:space="0" w:color="D8D2D4"/>
-          <w:right w:val="single" w:sz="4" w:space="0" w:color="D8D2D4"/>
-          <w:insideH w:val="single" w:sz="4" w:space="0" w:color="D8D2D4"/>
-          <w:insideV w:val="single" w:sz="4" w:space="0" w:color="D8D2D4"/>
-        </w:tblBorders>
-      </w:tblPr>
-      <w:tblGrid>
-        <w:gridCol w:w="7272"/>
-        <w:gridCol w:w="7272"/>
-      </w:tblGrid>
-      <w:tr>
-        <w:tc>
-          <w:tcPr>
-            <w:tcW w:type="dxa" w:w="7272"/>
-            <w:shd w:val="clear" w:color="auto" w:fill="7A2D30"/>
-          </w:tcPr>
-          <w:p>
-            <w:pPr>
-              <w:spacing w:after="40"/>
-            </w:pPr>
-            <w:r>
-              <w:rPr>
-                <w:b/>
-                <w:color w:val="FFFFFF"/>
-                <w:sz w:val="18"/>
-              </w:rPr>
-            </w:r>
-            <w:r>
-              <w:rPr>
-                <w:b/>
-                <w:i w:val="0"/>
-                <w:color w:val="FFFFFF"/>
-                <w:sz w:val="18"/>
-              </w:rPr>
-              <w:t>Benefits</w:t>
-            </w:r>
-          </w:p>
-        </w:tc>
-        <w:tc>
-          <w:tcPr>
-            <w:tcW w:type="dxa" w:w="7272"/>
-            <w:shd w:val="clear" w:color="auto" w:fill="7A2D30"/>
-          </w:tcPr>
-          <w:p>
-            <w:pPr>
-              <w:spacing w:after="40"/>
-            </w:pPr>
-            <w:r>
-              <w:rPr>
-                <w:b/>
-                <w:color w:val="FFFFFF"/>
-                <w:sz w:val="18"/>
-              </w:rPr>
-            </w:r>
-            <w:r>
-              <w:rPr>
-                <w:b/>
-                <w:i w:val="0"/>
-                <w:color w:val="FFFFFF"/>
-                <w:sz w:val="18"/>
-              </w:rPr>
-              <w:t>Risks</w:t>
-            </w:r>
-          </w:p>
-        </w:tc>
-      </w:tr>
-      <w:tr>
-        <w:tc>
-          <w:tcPr>
-            <w:tcW w:type="dxa" w:w="7272"/>
-          </w:tcPr>
-          <w:p>
-            <w:pPr>
-              <w:spacing w:after="40"/>
-            </w:pPr>
-            <w:r>
-              <w:rPr>
-                <w:sz w:val="18"/>
-              </w:rPr>
-            </w:r>
-            <w:r>
-              <w:rPr>
-                <w:b w:val="0"/>
-                <w:i w:val="0"/>
-                <w:sz w:val="18"/>
-              </w:rPr>
-              <w:t>Correction of hypoxia</w:t>
-            </w:r>
-            <w:r>
-              <w:rPr>
-                <w:sz w:val="18"/>
-              </w:rPr>
-              <w:br/>
-            </w:r>
-            <w:r>
-              <w:rPr>
-                <w:b w:val="0"/>
-                <w:i w:val="0"/>
-                <w:sz w:val="18"/>
-              </w:rPr>
-              <w:t>Symptom relief</w:t>
-            </w:r>
-            <w:r>
-              <w:rPr>
-                <w:sz w:val="18"/>
-              </w:rPr>
-              <w:br/>
-            </w:r>
-            <w:r>
-              <w:rPr>
-                <w:b w:val="0"/>
-                <w:i w:val="0"/>
-                <w:sz w:val="18"/>
-              </w:rPr>
-              <w:t>Therapeutic benefits</w:t>
-            </w:r>
-          </w:p>
-        </w:tc>
-        <w:tc>
-          <w:tcPr>
-            <w:tcW w:type="dxa" w:w="7272"/>
-          </w:tcPr>
-          <w:p>
-            <w:pPr>
-              <w:spacing w:after="40"/>
-            </w:pPr>
-            <w:r>
-              <w:rPr>
-                <w:sz w:val="18"/>
-              </w:rPr>
-            </w:r>
-            <w:r>
-              <w:rPr>
-                <w:b w:val="0"/>
-                <w:i w:val="0"/>
-                <w:sz w:val="18"/>
-                <w:highlight w:val="yellow"/>
-              </w:rPr>
-              <w:t>Fire hazard</w:t>
-            </w:r>
-            <w:r>
-              <w:rPr>
-                <w:b w:val="0"/>
-                <w:i w:val="0"/>
-                <w:sz w:val="18"/>
-              </w:rPr>
-              <w:t xml:space="preserve"> (oxygen is highly flammable)</w:t>
-            </w:r>
-            <w:r>
-              <w:rPr>
-                <w:sz w:val="18"/>
-              </w:rPr>
-              <w:br/>
-            </w:r>
-            <w:r>
-              <w:rPr>
-                <w:b w:val="0"/>
-                <w:i w:val="0"/>
-                <w:sz w:val="18"/>
-              </w:rPr>
-              <w:t>Hypercapnia, carbon dioxide retention</w:t>
-            </w:r>
-            <w:r>
-              <w:rPr>
-                <w:sz w:val="18"/>
-              </w:rPr>
-              <w:br/>
-            </w:r>
-            <w:r>
-              <w:rPr>
-                <w:b w:val="0"/>
-                <w:i w:val="0"/>
-                <w:sz w:val="18"/>
-              </w:rPr>
-              <w:t>Mucosal irritation</w:t>
-            </w:r>
-            <w:r>
-              <w:rPr>
-                <w:sz w:val="18"/>
-              </w:rPr>
-              <w:br/>
-            </w:r>
-            <w:r>
-              <w:rPr>
-                <w:b w:val="0"/>
-                <w:i w:val="0"/>
-                <w:sz w:val="18"/>
-              </w:rPr>
-              <w:t xml:space="preserve">Vasoconstriction — so oxygen is </w:t>
-            </w:r>
-            <w:r>
-              <w:rPr>
-                <w:b/>
-                <w:i w:val="0"/>
-                <w:sz w:val="18"/>
-              </w:rPr>
-              <w:t>not given in myocardial infarction unless saturation is below 91%</w:t>
-            </w:r>
-          </w:p>
-        </w:tc>
-      </w:tr>
-    </w:tbl>
     <w:p>
       <w:pPr>
-        <w:spacing w:after="80"/>
+        <w:pStyle w:val="ListBullet"/>
+        <w:spacing w:after="40"/>
       </w:pPr>
+      <w:r>
+        <w:rPr>
+          <w:b/>
+          <w:i w:val="0"/>
+          <w:sz w:val="20"/>
+        </w:rPr>
+        <w:t>Benefits of oxygen therapy:</w:t>
+      </w:r>
+      <w:r>
+        <w:rPr>
+          <w:b w:val="0"/>
+          <w:i w:val="0"/>
+          <w:sz w:val="20"/>
+        </w:rPr>
+        <w:t xml:space="preserve"> correction of hypoxia, symptom relief and therapeutic benefits.</w:t>
+      </w:r>
+    </w:p>
+    <w:p>
+      <w:pPr>
+        <w:pStyle w:val="ListBullet"/>
+        <w:spacing w:after="40"/>
+      </w:pPr>
+      <w:r>
+        <w:rPr>
+          <w:b/>
+          <w:i w:val="0"/>
+          <w:sz w:val="20"/>
+        </w:rPr>
+        <w:t xml:space="preserve">Hazard: </w:t>
+      </w:r>
+      <w:r>
+        <w:rPr>
+          <w:b/>
+          <w:i w:val="0"/>
+          <w:sz w:val="20"/>
+          <w:highlight w:val="yellow"/>
+        </w:rPr>
+        <w:t>fire</w:t>
+      </w:r>
+      <w:r>
+        <w:rPr>
+          <w:b/>
+          <w:i w:val="0"/>
+          <w:sz w:val="20"/>
+        </w:rPr>
+        <w:t>.</w:t>
+      </w:r>
+      <w:r>
+        <w:rPr>
+          <w:b w:val="0"/>
+          <w:i w:val="0"/>
+          <w:sz w:val="20"/>
+        </w:rPr>
+        <w:t xml:space="preserve"> Oxygen is highly flammable; fire is one of the biggest risks.</w:t>
+      </w:r>
+    </w:p>
+    <w:p>
+      <w:pPr>
+        <w:pStyle w:val="ListBullet"/>
+        <w:spacing w:after="40"/>
+      </w:pPr>
+      <w:r>
+        <w:rPr>
+          <w:b/>
+          <w:i w:val="0"/>
+          <w:sz w:val="20"/>
+        </w:rPr>
+        <w:t>Fire threatens anyone near the patient.</w:t>
+      </w:r>
+      <w:r>
+        <w:rPr>
+          <w:b w:val="0"/>
+          <w:i w:val="0"/>
+          <w:sz w:val="20"/>
+        </w:rPr>
+        <w:t xml:space="preserve"> Fire is the hazard that threatens anyone near the patient, not only the patient, because oxygen is highly flammable; hypercapnia, mucosal irritation and vasoconstriction injure only the person receiving the oxygen.</w:t>
+      </w:r>
+    </w:p>
+    <w:p>
+      <w:pPr>
+        <w:pStyle w:val="ListBullet"/>
+        <w:spacing w:after="40"/>
+      </w:pPr>
+      <w:r>
+        <w:rPr>
+          <w:b/>
+          <w:i w:val="0"/>
+          <w:sz w:val="20"/>
+        </w:rPr>
+        <w:t>Hazard: hypercapnia.</w:t>
+      </w:r>
+      <w:r>
+        <w:rPr>
+          <w:b w:val="0"/>
+          <w:i w:val="0"/>
+          <w:sz w:val="20"/>
+        </w:rPr>
+        <w:t xml:space="preserve"> Oxygen therapy risks carbon dioxide retention, a listed blood gas hazard.</w:t>
+      </w:r>
+    </w:p>
+    <w:p>
+      <w:pPr>
+        <w:pStyle w:val="ListBullet"/>
+        <w:spacing w:after="40"/>
+      </w:pPr>
+      <w:r>
+        <w:rPr>
+          <w:b/>
+          <w:i w:val="0"/>
+          <w:sz w:val="20"/>
+        </w:rPr>
+        <w:t>Hazard: mucosal irritation</w:t>
+      </w:r>
+      <w:r>
+        <w:rPr>
+          <w:b w:val="0"/>
+          <w:i w:val="0"/>
+          <w:sz w:val="20"/>
+        </w:rPr>
+        <w:t xml:space="preserve"> of the nose and airway lining.</w:t>
+      </w:r>
+    </w:p>
+    <w:p>
+      <w:pPr>
+        <w:pStyle w:val="ListBullet"/>
+        <w:spacing w:after="40"/>
+      </w:pPr>
+      <w:r>
+        <w:rPr>
+          <w:b/>
+          <w:i w:val="0"/>
+          <w:sz w:val="20"/>
+        </w:rPr>
+        <w:t>Hazard: vasoconstriction</w:t>
+      </w:r>
+      <w:r>
+        <w:rPr>
+          <w:b w:val="0"/>
+          <w:i w:val="0"/>
+          <w:sz w:val="20"/>
+        </w:rPr>
+        <w:t xml:space="preserve"> — so oxygen is </w:t>
+      </w:r>
+      <w:r>
+        <w:rPr>
+          <w:b/>
+          <w:i w:val="0"/>
+          <w:sz w:val="20"/>
+        </w:rPr>
+        <w:t>not given in myocardial infarction unless saturation is below 91%</w:t>
+      </w:r>
+      <w:r>
+        <w:rPr>
+          <w:b w:val="0"/>
+          <w:i w:val="0"/>
+          <w:sz w:val="20"/>
+        </w:rPr>
+        <w:t>.</w:t>
+      </w:r>
+    </w:p>
+    <w:p>
+      <w:pPr>
+        <w:pStyle w:val="ListBullet"/>
+        <w:spacing w:after="40"/>
+      </w:pPr>
+      <w:r>
+        <w:rPr>
+          <w:b/>
+          <w:i w:val="0"/>
+          <w:sz w:val="20"/>
+        </w:rPr>
+        <w:t>Oxygen in myocardial infarction.</w:t>
+      </w:r>
+      <w:r>
+        <w:rPr>
+          <w:b w:val="0"/>
+          <w:i w:val="0"/>
+          <w:sz w:val="20"/>
+        </w:rPr>
+        <w:t xml:space="preserve"> Oxygen is withheld in myocardial infarction because it causes vasoconstriction, but only while the saturation is 91% or higher; below 91% the benefit of correcting hypoxia wins and oxygen is given.</w:t>
+      </w:r>
     </w:p>
     <w:p>
       <w:pPr>
@@ -2019,6 +1990,20 @@
     </w:p>
     <w:p>
       <w:pPr>
+        <w:pStyle w:val="ListBullet"/>
+        <w:spacing w:after="40"/>
+      </w:pPr>
+      <w:r>
+        <w:rPr>
+          <w:b w:val="0"/>
+          <w:i w:val="0"/>
+          <w:sz w:val="20"/>
+        </w:rPr>
+        <w:t>The nasal cannula delivers oxygen through the nose; the simple, partial rebreather and non-rebreather masks fit over the face, covering the nose and mouth.</w:t>
+      </w:r>
+    </w:p>
+    <w:p>
+      <w:pPr>
         <w:pStyle w:val="Heading3"/>
         <w:spacing w:before="200" w:after="100"/>
       </w:pPr>
@@ -2049,7 +2034,7 @@
           <w:i w:val="0"/>
           <w:sz w:val="20"/>
         </w:rPr>
-        <w:t xml:space="preserve">: set the flow to </w:t>
+        <w:t xml:space="preserve">: set the flow (10–15 L/min) to </w:t>
       </w:r>
       <w:r>
         <w:rPr>
@@ -2065,7 +2050,7 @@
           <w:i w:val="0"/>
           <w:sz w:val="20"/>
         </w:rPr>
-        <w:t xml:space="preserve"> on inspiration.</w:t>
+        <w:t xml:space="preserve"> on inspiration. A reservoir bag that collapses each time the patient breathes in breaks this rule.</w:t>
       </w:r>
     </w:p>
     <w:p>
@@ -2257,11 +2242,27 @@
       </w:pPr>
       <w:r>
         <w:rPr>
+          <w:b w:val="0"/>
+          <w:i w:val="0"/>
+          <w:sz w:val="20"/>
+        </w:rPr>
+        <w:t xml:space="preserve">A nebulizer </w:t>
+      </w:r>
+      <w:r>
+        <w:rPr>
           <w:b/>
           <w:i w:val="0"/>
           <w:sz w:val="20"/>
         </w:rPr>
-        <w:t>Delivers liquid medication directly to the airways.</w:t>
+        <w:t>delivers liquid medication directly to the airways</w:t>
+      </w:r>
+      <w:r>
+        <w:rPr>
+          <w:b w:val="0"/>
+          <w:i w:val="0"/>
+          <w:sz w:val="20"/>
+        </w:rPr>
+        <w:t>.</w:t>
       </w:r>
     </w:p>
     <w:p>
@@ -2275,7 +2276,7 @@
           <w:i w:val="0"/>
           <w:sz w:val="20"/>
         </w:rPr>
-        <w:t xml:space="preserve">The medication is </w:t>
+        <w:t xml:space="preserve">The liquid medication is </w:t>
       </w:r>
       <w:r>
         <w:rPr>
@@ -2291,7 +2292,7 @@
           <w:i w:val="0"/>
           <w:sz w:val="20"/>
         </w:rPr>
-        <w:t xml:space="preserve"> needed.</w:t>
+        <w:t xml:space="preserve"> the condition needs.</w:t>
       </w:r>
     </w:p>
     <w:p>
@@ -2305,7 +2306,15 @@
           <w:i w:val="0"/>
           <w:sz w:val="20"/>
         </w:rPr>
-        <w:t>Secretion clearance.</w:t>
+        <w:t>Secretion clearance</w:t>
+      </w:r>
+      <w:r>
+        <w:rPr>
+          <w:b w:val="0"/>
+          <w:i w:val="0"/>
+          <w:sz w:val="20"/>
+        </w:rPr>
+        <w:t xml:space="preserve"> is a rationale for nebulizer therapy: it helps clear airway secretions.</w:t>
       </w:r>
     </w:p>
     <w:p>
@@ -2327,7 +2336,7 @@
           <w:i w:val="0"/>
           <w:sz w:val="20"/>
         </w:rPr>
-        <w:t>.</w:t>
+        <w:t>, so a nebulizer is chosen over an inhaler when an inhaler is hard for the patient to use.</w:t>
       </w:r>
     </w:p>
     <w:p>
@@ -2341,7 +2350,15 @@
           <w:i w:val="0"/>
           <w:sz w:val="20"/>
         </w:rPr>
-        <w:t>Severe exacerbations of respiratory illnesses.</w:t>
+        <w:t>Severe exacerbations of respiratory illnesses</w:t>
+      </w:r>
+      <w:r>
+        <w:rPr>
+          <w:b w:val="0"/>
+          <w:i w:val="0"/>
+          <w:sz w:val="20"/>
+        </w:rPr>
+        <w:t xml:space="preserve"> are a reason to deliver inhaled medication by nebulizer.</w:t>
       </w:r>
     </w:p>
     <w:p>
@@ -3277,6 +3294,44 @@
           <w:b/>
           <w:i w:val="0"/>
         </w:rPr>
+        <w:t>Simple mask when the nose is blocked.</w:t>
+      </w:r>
+      <w:r>
+        <w:rPr>
+          <w:b w:val="0"/>
+          <w:i w:val="0"/>
+        </w:rPr>
+        <w:t xml:space="preserve"> With both nostrils packed a nasal cannula would not deliver; a simple mask, a low flow device for mild to moderate distress that covers the nose and mouth, can still deliver oxygen at 5-10 L/min, whichever way she breathes.</w:t>
+      </w:r>
+    </w:p>
+    <w:p>
+      <w:pPr>
+        <w:spacing w:after="120"/>
+      </w:pPr>
+      <w:r>
+        <w:rPr>
+          <w:b/>
+          <w:i w:val="0"/>
+        </w:rPr>
+        <w:t>Cannula ceiling and the non-rebreather.</w:t>
+      </w:r>
+      <w:r>
+        <w:rPr>
+          <w:b w:val="0"/>
+          <w:i w:val="0"/>
+        </w:rPr>
+        <w:t xml:space="preserve"> The cannula's fraction tops out at 44%, so more flow gains nothing; the non-rebreather mask, used in severely hypoxic patients who are still ventilating well, delivers 60-100% at 10-15 L/min, while for mild hypoxia the nasal cannula is the most commonly used device.</w:t>
+      </w:r>
+    </w:p>
+    <w:p>
+      <w:pPr>
+        <w:spacing w:after="120"/>
+      </w:pPr>
+      <w:r>
+        <w:rPr>
+          <w:b/>
+          <w:i w:val="0"/>
+        </w:rPr>
         <w:t>The low-flow versus high-flow trap.</w:t>
       </w:r>
       <w:r>
@@ -3386,6 +3441,32 @@
           <w:sz w:val="20"/>
         </w:rPr>
         <w:t>Further monitoring for complications.</w:t>
+      </w:r>
+    </w:p>
+    <w:p>
+      <w:pPr>
+        <w:spacing w:after="120"/>
+      </w:pPr>
+      <w:r>
+        <w:rPr>
+          <w:b w:val="0"/>
+          <w:i w:val="0"/>
+        </w:rPr>
+        <w:t xml:space="preserve">So after the clinical and objective assessment come </w:t>
+      </w:r>
+      <w:r>
+        <w:rPr>
+          <w:b/>
+          <w:i w:val="0"/>
+        </w:rPr>
+        <w:t>vital signs and further monitoring for complications</w:t>
+      </w:r>
+      <w:r>
+        <w:rPr>
+          <w:b w:val="0"/>
+          <w:i w:val="0"/>
+        </w:rPr>
+        <w:t>, even when the patient is improving. A good response is a higher partial pressure of oxygen with no rise in carbon dioxide; a rising carbon dioxide is not a good response.</w:t>
       </w:r>
     </w:p>
     <w:p>
@@ -3497,7 +3578,33 @@
                 <w:b w:val="0"/>
                 <w:i w:val="0"/>
               </w:rPr>
-              <w:t>.</w:t>
+              <w:t>: while the patient still needs the oxygen, so a hospitalized patient is qualified before discharge, not after the need has passed.</w:t>
+            </w:r>
+          </w:p>
+          <w:p>
+            <w:pPr>
+              <w:spacing w:after="120"/>
+            </w:pPr>
+            <w:r>
+              <w:rPr>
+                <w:b w:val="0"/>
+                <w:i w:val="0"/>
+              </w:rPr>
+              <w:t xml:space="preserve">A normal resting saturation does not end the assessment: the next step is to check saturation </w:t>
+            </w:r>
+            <w:r>
+              <w:rPr>
+                <w:b/>
+                <w:i w:val="0"/>
+              </w:rPr>
+              <w:t>with exertion</w:t>
+            </w:r>
+            <w:r>
+              <w:rPr>
+                <w:b w:val="0"/>
+                <w:i w:val="0"/>
+              </w:rPr>
+              <w:t xml:space="preserve"> (and during sleep).</w:t>
             </w:r>
           </w:p>
           <w:tbl>
@@ -4101,6 +4208,25 @@
     </w:p>
     <w:p>
       <w:pPr>
+        <w:spacing w:after="120"/>
+      </w:pPr>
+      <w:r>
+        <w:rPr>
+          <w:b/>
+          <w:i w:val="0"/>
+        </w:rPr>
+        <w:t>Hematocrit in Group II.</w:t>
+      </w:r>
+      <w:r>
+        <w:rPr>
+          <w:b w:val="0"/>
+          <w:i w:val="0"/>
+        </w:rPr>
+        <w:t xml:space="preserve"> A hematocrit above 56%, which indicates polycythemia, supports Group II home oxygen qualification when the oxygen value is borderline (56 to 59 mm Hg or 89% saturation).</w:t>
+      </w:r>
+    </w:p>
+    <w:p>
+      <w:pPr>
         <w:pStyle w:val="Heading2"/>
         <w:spacing w:before="200" w:after="100"/>
       </w:pPr>
@@ -6589,7 +6715,7 @@
                 <w:i w:val="0"/>
                 <w:sz w:val="18"/>
               </w:rPr>
-              <w:t xml:space="preserve">Hydrogen ions move into cells, potassium moves out: </w:t>
+              <w:t xml:space="preserve">In acidosis, hydrogen ions move into cells and potassium moves out: </w:t>
             </w:r>
             <w:r>
               <w:rPr>
@@ -6620,7 +6746,7 @@
                 <w:i w:val="0"/>
                 <w:sz w:val="18"/>
               </w:rPr>
-              <w:t xml:space="preserve">Hydrogen ions move out of cells, potassium moves in: </w:t>
+              <w:t xml:space="preserve">In alkalosis, hydrogen ions move out of cells and potassium moves into cells, so serum potassium falls: </w:t>
             </w:r>
             <w:r>
               <w:rPr>
@@ -6676,7 +6802,7 @@
                 <w:i w:val="0"/>
                 <w:sz w:val="18"/>
               </w:rPr>
-              <w:t xml:space="preserve">Lower affinity; curve shifts </w:t>
+              <w:t xml:space="preserve">Acidosis lowers hemoglobin’s affinity for oxygen and shifts the curve to the </w:t>
             </w:r>
             <w:r>
               <w:rPr>
@@ -6692,7 +6818,7 @@
                 <w:i w:val="0"/>
                 <w:sz w:val="18"/>
               </w:rPr>
-              <w:t xml:space="preserve">; </w:t>
+              <w:t xml:space="preserve">, so </w:t>
             </w:r>
             <w:r>
               <w:rPr>
@@ -6708,7 +6834,7 @@
                 <w:i w:val="0"/>
                 <w:sz w:val="18"/>
               </w:rPr>
-              <w:t xml:space="preserve"> oxygen delivered to tissues</w:t>
+              <w:t xml:space="preserve"> oxygen is released to the tissues (delivery increases)</w:t>
             </w:r>
           </w:p>
         </w:tc>
@@ -6731,7 +6857,7 @@
                 <w:i w:val="0"/>
                 <w:sz w:val="18"/>
               </w:rPr>
-              <w:t xml:space="preserve">Higher affinity; curve shifts </w:t>
+              <w:t xml:space="preserve">Alkalosis increases hemoglobin’s affinity for oxygen and shifts the curve to the </w:t>
             </w:r>
             <w:r>
               <w:rPr>
@@ -6747,7 +6873,7 @@
                 <w:i w:val="0"/>
                 <w:sz w:val="18"/>
               </w:rPr>
-              <w:t xml:space="preserve">; </w:t>
+              <w:t xml:space="preserve">, so </w:t>
             </w:r>
             <w:r>
               <w:rPr>
@@ -6763,7 +6889,7 @@
                 <w:i w:val="0"/>
                 <w:sz w:val="18"/>
               </w:rPr>
-              <w:t xml:space="preserve"> oxygen delivered to tissues</w:t>
+              <w:t xml:space="preserve"> oxygen reaches the tissues (delivery decreases)</w:t>
             </w:r>
           </w:p>
         </w:tc>
@@ -6834,7 +6960,7 @@
                 <w:i w:val="0"/>
                 <w:sz w:val="18"/>
               </w:rPr>
-              <w:t xml:space="preserve">A high pH increases calcium binding to albumin: in severe respiratory alkalosis, </w:t>
+              <w:t xml:space="preserve">In alkalosis a high pH increases calcium binding to albumin: in severe respiratory alkalosis, </w:t>
             </w:r>
             <w:r>
               <w:rPr>
@@ -6997,6 +7123,63 @@
           <w:b/>
           <w:i w:val="0"/>
         </w:rPr>
+        <w:t>Acidosis and potassium.</w:t>
+      </w:r>
+      <w:r>
+        <w:rPr>
+          <w:b w:val="0"/>
+          <w:i w:val="0"/>
+        </w:rPr>
+        <w:t xml:space="preserve"> In acidosis, hydrogen ions shift from the extracellular fluid into cells and potassium shifts out of cells in exchange, raising the serum potassium, so a marked acidemia makes hyperkalemia expected.</w:t>
+      </w:r>
+    </w:p>
+    <w:p>
+      <w:pPr>
+        <w:spacing w:after="120"/>
+      </w:pPr>
+      <w:r>
+        <w:rPr>
+          <w:b/>
+          <w:i w:val="0"/>
+        </w:rPr>
+        <w:t>Alkalosis and hemoglobin.</w:t>
+      </w:r>
+      <w:r>
+        <w:rPr>
+          <w:b w:val="0"/>
+          <w:i w:val="0"/>
+        </w:rPr>
+        <w:t xml:space="preserve"> Alkalosis increases hemoglobin's affinity for oxygen, so less oxygen is released and delivery to the tissues decreases: the leftward shift of the oxygen-hemoglobin dissociation curve.</w:t>
+      </w:r>
+    </w:p>
+    <w:p>
+      <w:pPr>
+        <w:spacing w:after="120"/>
+      </w:pPr>
+      <w:r>
+        <w:rPr>
+          <w:b/>
+          <w:i w:val="0"/>
+        </w:rPr>
+        <w:t>Acidosis and hemoglobin.</w:t>
+      </w:r>
+      <w:r>
+        <w:rPr>
+          <w:b w:val="0"/>
+          <w:i w:val="0"/>
+        </w:rPr>
+        <w:t xml:space="preserve"> Acidosis decreases hemoglobin's affinity for oxygen and shifts the oxygen-hemoglobin dissociation curve to the right, so hemoglobin releases oxygen more readily and delivery to the tissues increases.</w:t>
+      </w:r>
+    </w:p>
+    <w:p>
+      <w:pPr>
+        <w:spacing w:after="120"/>
+      </w:pPr>
+      <w:r>
+        <w:rPr>
+          <w:b/>
+          <w:i w:val="0"/>
+        </w:rPr>
         <w:t>Unsustainable pH: below 6.7 or above 7.6.</w:t>
       </w:r>
       <w:r>
@@ -7054,6 +7237,14 @@
         </w:rPr>
         <w:t>More ventilation, less carbon dioxide; less ventilation, more carbon dioxide.</w:t>
       </w:r>
+      <w:r>
+        <w:rPr>
+          <w:b w:val="0"/>
+          <w:i w:val="0"/>
+          <w:sz w:val="20"/>
+        </w:rPr>
+        <w:t xml:space="preserve"> When ventilation increases, carbon dioxide decreases.</w:t>
+      </w:r>
     </w:p>
     <w:p>
       <w:pPr>
@@ -7082,7 +7273,7 @@
           <w:i w:val="0"/>
           <w:sz w:val="20"/>
         </w:rPr>
-        <w:t xml:space="preserve"> regulates respiration: more carbon dioxide → lower cerebral pH → more ventilation.</w:t>
+        <w:t xml:space="preserve"> regulates respiration: more carbon dioxide → lower cerebral pH → more ventilation. A rise in carbon dioxide therefore leads to increased ventilation.</w:t>
       </w:r>
     </w:p>
     <w:p>
@@ -7096,6 +7287,28 @@
           <w:i w:val="0"/>
           <w:sz w:val="20"/>
         </w:rPr>
+        <w:t>Brain stem chemoreceptor.</w:t>
+      </w:r>
+      <w:r>
+        <w:rPr>
+          <w:b w:val="0"/>
+          <w:i w:val="0"/>
+          <w:sz w:val="20"/>
+        </w:rPr>
+        <w:t xml:space="preserve"> A chemoreceptor in the brain stem regulates respiration: increased carbon dioxide lowers cerebral pH, which the brain stem answers with increased ventilation to clear the carbon dioxide.</w:t>
+      </w:r>
+    </w:p>
+    <w:p>
+      <w:pPr>
+        <w:pStyle w:val="ListBullet"/>
+        <w:spacing w:after="40"/>
+      </w:pPr>
+      <w:r>
+        <w:rPr>
+          <w:b/>
+          <w:i w:val="0"/>
+          <w:sz w:val="20"/>
+        </w:rPr>
         <w:t>Hypercapnia</w:t>
       </w:r>
       <w:r>
@@ -7573,6 +7786,25 @@
       </w:pPr>
       <w:r>
         <w:rPr>
+          <w:b/>
+          <w:i w:val="0"/>
+        </w:rPr>
+        <w:t>Chronic respiratory acidosis on a blood gas.</w:t>
+      </w:r>
+      <w:r>
+        <w:rPr>
+          <w:b w:val="0"/>
+          <w:i w:val="0"/>
+        </w:rPr>
+        <w:t xml:space="preserve"> A pH just below normal with a high carbon dioxide that matches it; with a carbon dioxide of 55, a bicarbonate of 30 (a rise of about 5, 1.5 x 3.5) is the size of chronic compensation. Obesity, sleep disordered breathing and chronic hypercapnia form the obesity hypoventilation triad.</w:t>
+      </w:r>
+    </w:p>
+    <w:p>
+      <w:pPr>
+        <w:spacing w:after="120"/>
+      </w:pPr>
+      <w:r>
+        <w:rPr>
           <w:b w:val="0"/>
           <w:i w:val="0"/>
         </w:rPr>
@@ -7676,7 +7908,7 @@
           <w:b w:val="0"/>
           <w:i w:val="0"/>
         </w:rPr>
-        <w:t xml:space="preserve"> salicylates, caffeine, nicotine, catecholamines, thyroxine. </w:t>
+        <w:t xml:space="preserve"> salicylates (aspirin), caffeine, nicotine, catecholamines, thyroxine. </w:t>
       </w:r>
       <w:r>
         <w:rPr>
@@ -7811,6 +8043,25 @@
           <w:i w:val="0"/>
         </w:rPr>
         <w:t>.</w:t>
+      </w:r>
+    </w:p>
+    <w:p>
+      <w:pPr>
+        <w:spacing w:after="120"/>
+      </w:pPr>
+      <w:r>
+        <w:rPr>
+          <w:b/>
+          <w:i w:val="0"/>
+        </w:rPr>
+        <w:t>Acute respiratory alkalosis on a blood gas.</w:t>
+      </w:r>
+      <w:r>
+        <w:rPr>
+          <w:b w:val="0"/>
+          <w:i w:val="0"/>
+        </w:rPr>
+        <w:t xml:space="preserve"> Alkalemia with a low carbon dioxide that matches it is respiratory; a bicarbonate that fell about 2 per 10 mm Hg is the acute response. Psychogenic hyperventilation and high altitude (hypoxia-induced hyperventilation) are listed causes, and perioral numbness is a listed finding.</w:t>
       </w:r>
     </w:p>
     <w:p>
@@ -8045,6 +8296,25 @@
       </w:pPr>
       <w:r>
         <w:rPr>
+          <w:b/>
+          <w:i w:val="0"/>
+        </w:rPr>
+        <w:t>Diuretic metabolic alkalosis.</w:t>
+      </w:r>
+      <w:r>
+        <w:rPr>
+          <w:b w:val="0"/>
+          <w:i w:val="0"/>
+        </w:rPr>
+        <w:t xml:space="preserve"> High pH with a high bicarbonate is metabolic alkalosis, and a low urine chloride marks the saline-responsive type; diuretic therapy is a saline-responsive cause, and low potassium and weakness fit.</w:t>
+      </w:r>
+    </w:p>
+    <w:p>
+      <w:pPr>
+        <w:spacing w:after="120"/>
+      </w:pPr>
+      <w:r>
+        <w:rPr>
           <w:b w:val="0"/>
           <w:i w:val="0"/>
         </w:rPr>
@@ -8120,7 +8390,7 @@
           <w:b w:val="0"/>
           <w:i w:val="0"/>
         </w:rPr>
-        <w:t xml:space="preserve"> methanol, metformin; uremia; diabetic ketoacidosis; paraldehyde; isoniazid, iron; lactic acidosis; ethylene glycol; salicylates, starvation (metabolic and drug or chemical anions). </w:t>
+        <w:t xml:space="preserve"> methanol, metformin; uremia; diabetic ketoacidosis; paraldehyde; isoniazid, iron; lactic acidosis; ethylene glycol; salicylates (aspirin), starvation (metabolic and drug or chemical anions). </w:t>
       </w:r>
       <w:r>
         <w:rPr>
@@ -8176,7 +8446,7 @@
           <w:b w:val="0"/>
           <w:i w:val="0"/>
         </w:rPr>
-        <w:t>In severe cases, profound hyperventilation: Kussmaul respirations (increased tidal volume and tachypnea) in diabetic ketoacidosis.</w:t>
+        <w:t>Compensation: the lungs increase ventilation to lower carbon dioxide and offset the acidosis. In severe cases, profound hyperventilation: Kussmaul respirations (increased tidal volume and tachypnea) in diabetic ketoacidosis.</w:t>
       </w:r>
       <w:r>
         <w:rPr>
@@ -8219,6 +8489,44 @@
           <w:i w:val="0"/>
         </w:rPr>
         <w:t>Carbon dioxide higher than the Winter formula predicts means an added respiratory acidosis, which can signal impending respiratory failure. A pH below 6.7 is unsustainable.</w:t>
+      </w:r>
+    </w:p>
+    <w:p>
+      <w:pPr>
+        <w:spacing w:after="120"/>
+      </w:pPr>
+      <w:r>
+        <w:rPr>
+          <w:b/>
+          <w:i w:val="0"/>
+        </w:rPr>
+        <w:t>Normal-gap acidosis on a blood gas.</w:t>
+      </w:r>
+      <w:r>
+        <w:rPr>
+          <w:b w:val="0"/>
+          <w:i w:val="0"/>
+        </w:rPr>
+        <w:t xml:space="preserve"> Low pH with a low bicarbonate, a gap within 9 to 15 and a high chloride is a normal-gap, hyperchloremic acidosis: saline infusion (chloride retention) and bicarbonate loss in diarrhea are listed causes.</w:t>
+      </w:r>
+    </w:p>
+    <w:p>
+      <w:pPr>
+        <w:spacing w:after="120"/>
+      </w:pPr>
+      <w:r>
+        <w:rPr>
+          <w:b/>
+          <w:i w:val="0"/>
+        </w:rPr>
+        <w:t>Elevated-gap acidosis on a blood gas.</w:t>
+      </w:r>
+      <w:r>
+        <w:rPr>
+          <w:b w:val="0"/>
+          <w:i w:val="0"/>
+        </w:rPr>
+        <w:t xml:space="preserve"> Low pH with a low bicarbonate and a gap above 9 to 15 is an elevated-gap metabolic acidosis: uremia and diabetic ketoacidosis are elevated-gap causes, and Kussmaul breathing is the compensation.</w:t>
       </w:r>
     </w:p>
     <w:p>
@@ -8503,39 +8811,7 @@
                 <w:i w:val="0"/>
                 <w:sz w:val="20"/>
               </w:rPr>
-              <w:t xml:space="preserve">Measured carbon dioxide </w:t>
-            </w:r>
-            <w:r>
-              <w:rPr>
-                <w:b/>
-                <w:i w:val="0"/>
-                <w:sz w:val="20"/>
-              </w:rPr>
-              <w:t>lower</w:t>
-            </w:r>
-            <w:r>
-              <w:rPr>
-                <w:b w:val="0"/>
-                <w:i w:val="0"/>
-                <w:sz w:val="20"/>
-              </w:rPr>
-              <w:t xml:space="preserve"> than expected is the mirror image: more hyperventilation than compensation explains, so a second, </w:t>
-            </w:r>
-            <w:r>
-              <w:rPr>
-                <w:b/>
-                <w:i w:val="0"/>
-                <w:sz w:val="20"/>
-              </w:rPr>
-              <w:t>respiratory alkalosis</w:t>
-            </w:r>
-            <w:r>
-              <w:rPr>
-                <w:b w:val="0"/>
-                <w:i w:val="0"/>
-                <w:sz w:val="20"/>
-              </w:rPr>
-              <w:t xml:space="preserve"> is present too (each disturbance has its own compensation). Salicylates appear on both lists: the elevated-gap causes and the toxic causes of respiratory alkalosis.</w:t>
+              <w:t>Salicylates appear on both lists: the elevated-gap causes and the toxic causes of respiratory alkalosis.</w:t>
             </w:r>
           </w:p>
           <w:p>
@@ -8559,6 +8835,25 @@
       <w:pPr>
         <w:spacing w:after="80"/>
       </w:pPr>
+    </w:p>
+    <w:p>
+      <w:pPr>
+        <w:spacing w:after="120"/>
+      </w:pPr>
+      <w:r>
+        <w:rPr>
+          <w:b/>
+          <w:i w:val="0"/>
+        </w:rPr>
+        <w:t>Winter formula with a bicarbonate of 10.</w:t>
+      </w:r>
+      <w:r>
+        <w:rPr>
+          <w:b w:val="0"/>
+          <w:i w:val="0"/>
+        </w:rPr>
+        <w:t xml:space="preserve"> Expected carbon dioxide = 1.5 x 10 + 8 = 23, plus or minus 2, so 21 to 25 mm Hg is the appropriately compensated value.</w:t>
+      </w:r>
     </w:p>
     <w:tbl>
       <w:tblPr>
@@ -9263,6 +9558,25 @@
     </w:p>
     <w:p>
       <w:pPr>
+        <w:spacing w:after="120"/>
+      </w:pPr>
+      <w:r>
+        <w:rPr>
+          <w:b/>
+          <w:i w:val="0"/>
+        </w:rPr>
+        <w:t>Expected bicarbonate in acute respiratory alkalosis.</w:t>
+      </w:r>
+      <w:r>
+        <w:rPr>
+          <w:b w:val="0"/>
+          <w:i w:val="0"/>
+        </w:rPr>
+        <w:t xml:space="preserve"> Acutely, bicarbonate falls about 2 per 10 mm Hg fall in carbon dioxide: a fall of 15 (40 to 25) takes it from 24 to about 21 mEq/L. Altitude is a listed hypoxic cause of hyperventilation.</w:t>
+      </w:r>
+    </w:p>
+    <w:p>
+      <w:pPr>
         <w:pStyle w:val="ListBullet"/>
         <w:spacing w:after="40"/>
       </w:pPr>
@@ -9305,6 +9619,50 @@
           <w:sz w:val="20"/>
         </w:rPr>
         <w:t>. That is why a small bicarbonate rise means acute and a large one chronic.</w:t>
+      </w:r>
+    </w:p>
+    <w:p>
+      <w:pPr>
+        <w:pStyle w:val="ListBullet"/>
+        <w:spacing w:after="40"/>
+      </w:pPr>
+      <w:r>
+        <w:rPr>
+          <w:b/>
+          <w:i w:val="0"/>
+          <w:sz w:val="20"/>
+        </w:rPr>
+        <w:t>Acute or chronic?</w:t>
+      </w:r>
+      <w:r>
+        <w:rPr>
+          <w:b w:val="0"/>
+          <w:i w:val="0"/>
+          <w:sz w:val="20"/>
+        </w:rPr>
+        <w:t xml:space="preserve"> In respiratory acidosis, bicarbonate rises about 1 mEq/L per 10 mm Hg rise in carbon dioxide when acute and about 3.5 when chronic. In respiratory alkalosis, bicarbonate falls about 2 mEq/L per 10 mm Hg fall in carbon dioxide when acute and about 5 when chronic. A bicarbonate still near normal (22–26) with an abnormal carbon dioxide means an acute disorder; a large change means a chronic one.</w:t>
+      </w:r>
+    </w:p>
+    <w:p>
+      <w:pPr>
+        <w:pStyle w:val="ListBullet"/>
+        <w:spacing w:after="40"/>
+      </w:pPr>
+      <w:r>
+        <w:rPr>
+          <w:b/>
+          <w:i w:val="0"/>
+          <w:sz w:val="20"/>
+        </w:rPr>
+        <w:t>Metabolic alkalosis:</w:t>
+      </w:r>
+      <w:r>
+        <w:rPr>
+          <w:b w:val="0"/>
+          <w:i w:val="0"/>
+          <w:sz w:val="20"/>
+        </w:rPr>
+        <w:t xml:space="preserve"> carbon dioxide rises about 0.75 mm Hg for each 1 mEq/L rise in bicarbonate. Example: bicarbonate 32 is 8 above 24, so expected carbon dioxide is 40 + 8 × 0.75 = 46 mm Hg.</w:t>
       </w:r>
     </w:p>
     <w:p>
@@ -9548,6 +9906,44 @@
       <w:pPr>
         <w:spacing w:after="80"/>
       </w:pPr>
+    </w:p>
+    <w:p>
+      <w:pPr>
+        <w:spacing w:after="120"/>
+      </w:pPr>
+      <w:r>
+        <w:rPr>
+          <w:b/>
+          <w:i w:val="0"/>
+        </w:rPr>
+        <w:t>Anion gap of 30.</w:t>
+      </w:r>
+      <w:r>
+        <w:rPr>
+          <w:b w:val="0"/>
+          <w:i w:val="0"/>
+        </w:rPr>
+        <w:t xml:space="preserve"> Anion gap = sodium - (chloride + bicarbonate) = 140 - (102 + 8) = 30, above the normal 9 to 15: an elevated-gap metabolic acidosis, fitting ethylene glycol, the E of the mnemonic.</w:t>
+      </w:r>
+    </w:p>
+    <w:p>
+      <w:pPr>
+        <w:spacing w:after="120"/>
+      </w:pPr>
+      <w:r>
+        <w:rPr>
+          <w:b/>
+          <w:i w:val="0"/>
+        </w:rPr>
+        <w:t>Anion gap of 10.</w:t>
+      </w:r>
+      <w:r>
+        <w:rPr>
+          <w:b w:val="0"/>
+          <w:i w:val="0"/>
+        </w:rPr>
+        <w:t xml:space="preserve"> Anion gap = 138 - (114 + 14) = 10, within the normal 9 to 15; with a low bicarbonate and a high chloride, this is a normal-gap (hyperchloremic) metabolic acidosis.</w:t>
+      </w:r>
     </w:p>
     <w:tbl>
       <w:tblPr>

</xml_diff>